<commit_message>
docs: reorganize documentation structure, embed high-resolution diagrams and detailed text in PRD.docx/PDF
</commit_message>
<xml_diff>
--- a/GharBuddy_HackOn_PRD.docx
+++ b/GharBuddy_HackOn_PRD.docx
@@ -2092,10 +2092,56 @@
     </w:tbl>
     <w:p>
       <w:pPr>
+        <w:jc w:val="center"/>
+      </w:pPr>
+      <w:r>
+        <w:rPr>
+          <w:rFonts w:ascii="Calibri" w:hAnsi="Calibri"/>
+          <w:i/>
+          <w:sz w:val="18"/>
+        </w:rPr>
+        <w:t>Figure 1: Morning Routine Automation and Telemetry Sequence</w:t>
+      </w:r>
+    </w:p>
+    <w:p>
+      <w:pPr>
         <w:spacing w:after="40" w:before="40"/>
-      </w:pPr>
-      <w:r>
-        <w:t xml:space="preserve"/>
+        <w:jc w:val="center"/>
+      </w:pPr>
+      <w:r/>
+      <w:r>
+        <w:drawing>
+          <wp:inline xmlns:a="http://schemas.openxmlformats.org/drawingml/2006/main" xmlns:pic="http://schemas.openxmlformats.org/drawingml/2006/picture">
+            <wp:extent cx="5029200" cy="3443473"/>
+            <wp:docPr id="1" name="Picture 1"/>
+            <wp:cNvGraphicFramePr>
+              <a:graphicFrameLocks noChangeAspect="1"/>
+            </wp:cNvGraphicFramePr>
+            <a:graphic>
+              <a:graphicData uri="http://schemas.openxmlformats.org/drawingml/2006/picture">
+                <pic:pic>
+                  <pic:nvPicPr>
+                    <pic:cNvPr id="0" name="morning_routine_sequence.png"/>
+                    <pic:cNvPicPr/>
+                  </pic:nvPicPr>
+                  <pic:blipFill>
+                    <a:blip r:embed="rId8"/>
+                    <a:stretch>
+                      <a:fillRect/>
+                    </a:stretch>
+                  </pic:blipFill>
+                  <pic:spPr>
+                    <a:xfrm>
+                      <a:off x="0" y="0"/>
+                      <a:ext cx="5029200" cy="3443473"/>
+                    </a:xfrm>
+                    <a:prstGeom prst="rect"/>
+                  </pic:spPr>
+                </pic:pic>
+              </a:graphicData>
+            </a:graphic>
+          </wp:inline>
+        </w:drawing>
       </w:r>
     </w:p>
     <w:p>
@@ -2205,10 +2251,74 @@
     </w:p>
     <w:p>
       <w:pPr>
+        <w:jc w:val="center"/>
+      </w:pPr>
+      <w:r>
+        <w:rPr>
+          <w:rFonts w:ascii="Calibri" w:hAnsi="Calibri"/>
+          <w:i/>
+          <w:sz w:val="18"/>
+        </w:rPr>
+        <w:t>Figure 2: GharBuddy High-Level Component and Data Flow Architecture</w:t>
+      </w:r>
+    </w:p>
+    <w:p>
+      <w:r>
+        <w:rPr>
+          <w:rFonts w:ascii="Calibri" w:hAnsi="Calibri"/>
+          <w:sz w:val="21"/>
+        </w:rPr>
+        <w:t>Event-Driven Telemetry Loop: IoT sensor inputs (motion, cooker whistles, water levels) are processed by the FastAPI backend. Every event is passed to the context builder, which dynamically updates the simulated household map. State changes are pushed instantly (latency &lt; 100ms) to the React frontend using a robust WebSocket protocol with exponential backoff reconnection. Simultaneously, Bedrock evaluates rules for automated control.</w:t>
+      </w:r>
+    </w:p>
+    <w:p>
+      <w:r>
+        <w:rPr>
+          <w:rFonts w:ascii="Calibri" w:hAnsi="Calibri"/>
+          <w:sz w:val="21"/>
+        </w:rPr>
+        <w:t>Database and Vector Storage: The PostgreSQL database leverages the pgvector extension to perform cosine similarity queries over custom preference rules. High-dimensional vector coordinates represent rule contents embedded via Titan Multimodal. An in-memory cache layer speeds up subsequent queries by checking MD5 text hashes, significantly reducing AWS Bedrock token costs and latency.</w:t>
+      </w:r>
+    </w:p>
+    <w:p>
+      <w:pPr>
         <w:spacing w:after="40" w:before="40"/>
-      </w:pPr>
-      <w:r>
-        <w:t xml:space="preserve"/>
+        <w:jc w:val="center"/>
+      </w:pPr>
+      <w:r/>
+      <w:r>
+        <w:drawing>
+          <wp:inline xmlns:a="http://schemas.openxmlformats.org/drawingml/2006/main" xmlns:pic="http://schemas.openxmlformats.org/drawingml/2006/picture">
+            <wp:extent cx="5029200" cy="2291531"/>
+            <wp:docPr id="2" name="Picture 2"/>
+            <wp:cNvGraphicFramePr>
+              <a:graphicFrameLocks noChangeAspect="1"/>
+            </wp:cNvGraphicFramePr>
+            <a:graphic>
+              <a:graphicData uri="http://schemas.openxmlformats.org/drawingml/2006/picture">
+                <pic:pic>
+                  <pic:nvPicPr>
+                    <pic:cNvPr id="0" name="system_architecture.png"/>
+                    <pic:cNvPicPr/>
+                  </pic:nvPicPr>
+                  <pic:blipFill>
+                    <a:blip r:embed="rId9"/>
+                    <a:stretch>
+                      <a:fillRect/>
+                    </a:stretch>
+                  </pic:blipFill>
+                  <pic:spPr>
+                    <a:xfrm>
+                      <a:off x="0" y="0"/>
+                      <a:ext cx="5029200" cy="2291531"/>
+                    </a:xfrm>
+                    <a:prstGeom prst="rect"/>
+                  </pic:spPr>
+                </pic:pic>
+              </a:graphicData>
+            </a:graphic>
+          </wp:inline>
+        </w:drawing>
       </w:r>
     </w:p>
     <w:tbl>
@@ -3840,11 +3950,84 @@
       </w:r>
     </w:p>
     <w:p>
+      <w:r>
+        <w:rPr>
+          <w:rFonts w:ascii="Calibri" w:hAnsi="Calibri"/>
+          <w:sz w:val="21"/>
+        </w:rPr>
+        <w:t>Conflict Resolution Priority Hierarchy: To prevent conflicting automation commands, AWS Bedrock evaluates all decisions using a strict 5-level priority system: (1) Manual user overrides, (2) Critical safety guardrails, (3) Indian cultural and fasting calendars, (4) Probabilistic routine predictions from the local LSTM, and (5) Non-urgent energy savings. This structure guarantees that safety and user preferences always supersede automated routines.</w:t>
+      </w:r>
+    </w:p>
+    <w:p>
+      <w:r>
+        <w:rPr>
+          <w:rFonts w:ascii="Calibri" w:hAnsi="Calibri"/>
+          <w:sz w:val="21"/>
+        </w:rPr>
+        <w:t>Local ONNX LSTM Routine Predictor: Routine prediction is handled by a locally hosted PyTorch LSTM sequence classifier exported to the ONNX runtime format. By training on a 30-day sliding history of sensor event sequences (48 slots per day), the model anticipates user routine transitions with high accuracy. A background daemon thread automatically triggers weekly retraining of the network, maintaining adaptability as the household's habits evolve.</w:t>
+      </w:r>
+    </w:p>
+    <w:p>
+      <w:r>
+        <w:rPr>
+          <w:rFonts w:ascii="Calibri" w:hAnsi="Calibri"/>
+          <w:sz w:val="21"/>
+        </w:rPr>
+        <w:t>Rule Consolidation and Embedding Cache: When multiple similar preference rules are added, a consolidation pipeline runs in the background. It utilizes Claude to analyze overlap (e.g. combining 'Never turn on geyser at 6 AM' and 'Never turn on geyser before 6:30 AM') and merges them into simplified rules. The embedding cache maps identical query texts to saved vector objects, preventing redundant calls to Titan Embeddings.</w:t>
+      </w:r>
+    </w:p>
+    <w:p>
+      <w:pPr>
+        <w:jc w:val="center"/>
+      </w:pPr>
+      <w:r>
+        <w:rPr>
+          <w:rFonts w:ascii="Calibri" w:hAnsi="Calibri"/>
+          <w:i/>
+          <w:sz w:val="18"/>
+        </w:rPr>
+        <w:t>Figure 3: Hybrid AI Reasoning Pipeline and Conflict Resolution</w:t>
+      </w:r>
+    </w:p>
+    <w:p>
       <w:pPr>
         <w:spacing w:after="40" w:before="40"/>
-      </w:pPr>
-      <w:r>
-        <w:t xml:space="preserve"/>
+        <w:jc w:val="center"/>
+      </w:pPr>
+      <w:r/>
+      <w:r>
+        <w:drawing>
+          <wp:inline xmlns:a="http://schemas.openxmlformats.org/drawingml/2006/main" xmlns:pic="http://schemas.openxmlformats.org/drawingml/2006/picture">
+            <wp:extent cx="5029200" cy="1903966"/>
+            <wp:docPr id="3" name="Picture 3"/>
+            <wp:cNvGraphicFramePr>
+              <a:graphicFrameLocks noChangeAspect="1"/>
+            </wp:cNvGraphicFramePr>
+            <a:graphic>
+              <a:graphicData uri="http://schemas.openxmlformats.org/drawingml/2006/picture">
+                <pic:pic>
+                  <pic:nvPicPr>
+                    <pic:cNvPr id="0" name="ai_reasoning_pipeline.png"/>
+                    <pic:cNvPicPr/>
+                  </pic:nvPicPr>
+                  <pic:blipFill>
+                    <a:blip r:embed="rId10"/>
+                    <a:stretch>
+                      <a:fillRect/>
+                    </a:stretch>
+                  </pic:blipFill>
+                  <pic:spPr>
+                    <a:xfrm>
+                      <a:off x="0" y="0"/>
+                      <a:ext cx="5029200" cy="1903966"/>
+                    </a:xfrm>
+                    <a:prstGeom prst="rect"/>
+                  </pic:spPr>
+                </pic:pic>
+              </a:graphicData>
+            </a:graphic>
+          </wp:inline>
+        </w:drawing>
       </w:r>
     </w:p>
     <w:p>

</xml_diff>

<commit_message>
docs: remove old diagram PNGs, update PRD docx and PDF with new PlantUML diagrams
</commit_message>
<xml_diff>
--- a/GharBuddy_HackOn_PRD.docx
+++ b/GharBuddy_HackOn_PRD.docx
@@ -2112,7 +2112,7 @@
       <w:r>
         <w:drawing>
           <wp:inline xmlns:a="http://schemas.openxmlformats.org/drawingml/2006/main" xmlns:pic="http://schemas.openxmlformats.org/drawingml/2006/picture">
-            <wp:extent cx="5029200" cy="3443473"/>
+            <wp:extent cx="5029200" cy="5244693"/>
             <wp:docPr id="1" name="Picture 1"/>
             <wp:cNvGraphicFramePr>
               <a:graphicFrameLocks noChangeAspect="1"/>
@@ -2133,7 +2133,7 @@
                   <pic:spPr>
                     <a:xfrm>
                       <a:off x="0" y="0"/>
-                      <a:ext cx="5029200" cy="3443473"/>
+                      <a:ext cx="5029200" cy="5244693"/>
                     </a:xfrm>
                     <a:prstGeom prst="rect"/>
                   </pic:spPr>
@@ -2289,7 +2289,7 @@
       <w:r>
         <w:drawing>
           <wp:inline xmlns:a="http://schemas.openxmlformats.org/drawingml/2006/main" xmlns:pic="http://schemas.openxmlformats.org/drawingml/2006/picture">
-            <wp:extent cx="5029200" cy="2291531"/>
+            <wp:extent cx="5029200" cy="2130531"/>
             <wp:docPr id="2" name="Picture 2"/>
             <wp:cNvGraphicFramePr>
               <a:graphicFrameLocks noChangeAspect="1"/>
@@ -2310,7 +2310,7 @@
                   <pic:spPr>
                     <a:xfrm>
                       <a:off x="0" y="0"/>
-                      <a:ext cx="5029200" cy="2291531"/>
+                      <a:ext cx="5029200" cy="2130531"/>
                     </a:xfrm>
                     <a:prstGeom prst="rect"/>
                   </pic:spPr>
@@ -3998,7 +3998,7 @@
       <w:r>
         <w:drawing>
           <wp:inline xmlns:a="http://schemas.openxmlformats.org/drawingml/2006/main" xmlns:pic="http://schemas.openxmlformats.org/drawingml/2006/picture">
-            <wp:extent cx="5029200" cy="1903966"/>
+            <wp:extent cx="2159566" cy="6858000"/>
             <wp:docPr id="3" name="Picture 3"/>
             <wp:cNvGraphicFramePr>
               <a:graphicFrameLocks noChangeAspect="1"/>
@@ -4019,7 +4019,7 @@
                   <pic:spPr>
                     <a:xfrm>
                       <a:off x="0" y="0"/>
-                      <a:ext cx="5029200" cy="1903966"/>
+                      <a:ext cx="2159566" cy="6858000"/>
                     </a:xfrm>
                     <a:prstGeom prst="rect"/>
                   </pic:spPr>

</xml_diff>